<commit_message>
Update Part 1 analytics insights report
</commit_message>
<xml_diff>
--- a/part1_data_analytics/Part_1_Data_Analytics_Insights_Report_Final.docx
+++ b/part1_data_analytics/Part_1_Data_Analytics_Insights_Report_Final.docx
@@ -63,7 +63,13 @@
         <w:spacing w:after="0"/>
       </w:pPr>
       <w:r>
-        <w:t>This analysis transforms 48,204 traffic and weather records from the westbound I-94 corridor near Minneapolis-St Paul into evidence for traffic planning. SQLite was used for annual and holiday analysis, Python was used for statistics and probability, and Power BI was used to create an interactive dashboard for non-technical stakeholders. The central finding is that time of day is a much clearer operational signal than temperature alone.</w:t>
+        <w:t xml:space="preserve">This analysis transforms 48,204 traffic and weather records from the westbound I-94 corridor near Minneapolis-St Paul into evidence for traffic planning. </w:t>
+      </w:r>
+      <w:r>
+        <w:t xml:space="preserve">SQLite was used for annual and holiday analysis, Excel was used for descriptive statistics, correlation and probability calculations, and Power BI was used to create an interactive dashboard for non-technical stakeholders. </w:t>
+      </w:r>
+      <w:r>
+        <w:t>The central finding is that time of day is a much clearer operational signal than temperature alone.</w:t>
       </w:r>
     </w:p>
     <w:p>
@@ -85,7 +91,19 @@
         <w:spacing w:after="0"/>
       </w:pPr>
       <w:r>
-        <w:t>The raw file contains 48,204 rows and 9 columns. Seventeen exact duplicate rows were identified. The holiday column has 48,143 blanks because ordinary dates are not holidays; no other column has missing values. Numeric and date-time types were checked in Power Query, Hour was extracted, temperature was converted to Celsius, and traffic was categorised as Low below 4,500, Medium from 4,500 to 5,500, and High above 5,500. Ten impossible 0 Kelvin readings and one rainfall value of 9,831.3 mm were flagged. The 0 Kelvin readings were excluded from the temperature scatter plot.</w:t>
+        <w:t xml:space="preserve">The raw file contains 48,204 rows and 9 columns. Seventeen exact duplicate rows were identified. </w:t>
+      </w:r>
+      <w:r>
+        <w:t>The holiday column contains 48,143</w:t>
+      </w:r>
+      <w:r>
+        <w:t xml:space="preserve"> ‘None’ </w:t>
+      </w:r>
+      <w:r>
+        <w:t>labels representing ordinary non-holiday dates; no source column contains blank or missing values</w:t>
+      </w:r>
+      <w:r>
+        <w:t>. Numeric and date-time types were checked in Power Query, Hour was extracted, temperature was converted to Celsius, and traffic was categorised as Low below 4,500, Medium from 4,500 to 5,500, and High above 5,500. Ten impossible 0 Kelvin readings and one rainfall value of 9,831.3 mm were flagged. The 0 Kelvin readings were excluded from the temperature scatter plot.</w:t>
       </w:r>
     </w:p>
     <w:p>
@@ -14182,6 +14200,19 @@
       </w:tcPr>
     </w:tblStylePr>
   </w:style>
+  <w:style w:type="character" w:styleId="HTMLCode">
+    <w:name w:val="HTML Code"/>
+    <w:basedOn w:val="DefaultParagraphFont"/>
+    <w:uiPriority w:val="99"/>
+    <w:semiHidden/>
+    <w:unhideWhenUsed/>
+    <w:rsid w:val="00FA327C"/>
+    <w:rPr>
+      <w:rFonts w:ascii="Courier New" w:eastAsia="Times New Roman" w:hAnsi="Courier New" w:cs="Courier New"/>
+      <w:sz w:val="20"/>
+      <w:szCs w:val="20"/>
+    </w:rPr>
+  </w:style>
 </w:styles>
 </file>
 

</xml_diff>